<commit_message>
Rebuild burial form to match official two-page layout
</commit_message>
<xml_diff>
--- a/templates_word/ho_tro_mai_tang.docx
+++ b/templates_word/ho_tro_mai_tang.docx
@@ -4,478 +4,720 @@
   <w:body>
     <w:p>
       <w:pPr>
+        <w:spacing w:before="0" w:after="0" w:line="240" w:lineRule="auto"/>
+        <w:ind w:left="0"/>
         <w:jc w:val="center"/>
       </w:pPr>
       <w:r>
         <w:rPr>
+          <w:rFonts w:ascii="Times New Roman" w:hAnsi="Times New Roman" w:eastAsia="Times New Roman"/>
           <w:b/>
-          <w:sz w:val="26"/>
+          <w:i w:val="0"/>
+          <w:sz w:val="22"/>
         </w:rPr>
         <w:t>CỘNG HÒA XÃ HỘI CHỦ NGHĨA VIỆT NAM</w:t>
-        <w:br/>
+      </w:r>
+    </w:p>
+    <w:p>
+      <w:pPr>
+        <w:spacing w:before="0" w:after="0" w:line="240" w:lineRule="auto"/>
+        <w:ind w:left="0"/>
+        <w:jc w:val="center"/>
+      </w:pPr>
+      <w:r>
+        <w:rPr>
+          <w:rFonts w:ascii="Times New Roman" w:hAnsi="Times New Roman" w:eastAsia="Times New Roman"/>
+          <w:b/>
+          <w:i w:val="0"/>
+          <w:sz w:val="22"/>
+        </w:rPr>
         <w:t>Độc lập - Tự do - Hạnh phúc</w:t>
-        <w:br/>
+      </w:r>
+    </w:p>
+    <w:p>
+      <w:pPr>
+        <w:spacing w:before="0" w:after="80" w:line="240" w:lineRule="auto"/>
+        <w:ind w:left="0"/>
+        <w:jc w:val="center"/>
+      </w:pPr>
+      <w:r>
+        <w:rPr>
+          <w:rFonts w:ascii="Times New Roman" w:hAnsi="Times New Roman" w:eastAsia="Times New Roman"/>
+          <w:b w:val="0"/>
+          <w:i w:val="0"/>
+          <w:sz w:val="22"/>
+        </w:rPr>
         <w:t>---------------</w:t>
       </w:r>
     </w:p>
     <w:p>
       <w:pPr>
+        <w:spacing w:before="0" w:after="80" w:line="240" w:lineRule="auto"/>
+        <w:ind w:left="0"/>
         <w:jc w:val="center"/>
       </w:pPr>
       <w:r>
         <w:rPr>
+          <w:rFonts w:ascii="Times New Roman" w:hAnsi="Times New Roman" w:eastAsia="Times New Roman"/>
           <w:b/>
           <w:i w:val="0"/>
-          <w:sz w:val="28"/>
+          <w:sz w:val="24"/>
         </w:rPr>
         <w:t>TỜ KHAI ĐỀ NGHỊ HỖ TRỢ CHI PHÍ MAI TÁNG</w:t>
       </w:r>
     </w:p>
     <w:p>
       <w:pPr>
+        <w:spacing w:before="0" w:after="100" w:line="240" w:lineRule="auto"/>
+        <w:ind w:left="0"/>
         <w:jc w:val="center"/>
       </w:pPr>
       <w:r>
         <w:rPr>
+          <w:rFonts w:ascii="Times New Roman" w:hAnsi="Times New Roman" w:eastAsia="Times New Roman"/>
           <w:b w:val="0"/>
           <w:i w:val="0"/>
-          <w:sz w:val="26"/>
+          <w:sz w:val="22"/>
         </w:rPr>
         <w:t>Kính gửi: Chủ tịch Ủy ban nhân dân phường Minh Phụng</w:t>
       </w:r>
     </w:p>
     <w:p>
+      <w:pPr>
+        <w:spacing w:before="0" w:after="40" w:line="240" w:lineRule="auto"/>
+        <w:ind w:left="0"/>
+        <w:jc w:val="both"/>
+      </w:pPr>
       <w:r>
         <w:rPr>
+          <w:rFonts w:ascii="Times New Roman" w:hAnsi="Times New Roman" w:eastAsia="Times New Roman"/>
           <w:b/>
           <w:i w:val="0"/>
-          <w:sz w:val="26"/>
+          <w:sz w:val="22"/>
         </w:rPr>
         <w:t>1. Thông tin người đề nghị (người khai)</w:t>
       </w:r>
     </w:p>
     <w:p>
+      <w:pPr>
+        <w:spacing w:before="0" w:after="20" w:line="240" w:lineRule="auto"/>
+        <w:ind w:left="0"/>
+        <w:jc w:val="both"/>
+      </w:pPr>
       <w:r>
         <w:rPr>
+          <w:rFonts w:ascii="Times New Roman" w:hAnsi="Times New Roman" w:eastAsia="Times New Roman"/>
           <w:b w:val="0"/>
           <w:i w:val="0"/>
-          <w:sz w:val="26"/>
+          <w:sz w:val="22"/>
         </w:rPr>
         <w:t>Họ, chữ đệm, tên (Viết chữ in hoa): {{full_name}}</w:t>
       </w:r>
     </w:p>
     <w:p>
+      <w:pPr>
+        <w:spacing w:before="0" w:after="20" w:line="240" w:lineRule="auto"/>
+        <w:ind w:left="0"/>
+        <w:jc w:val="both"/>
+      </w:pPr>
       <w:r>
         <w:rPr>
+          <w:rFonts w:ascii="Times New Roman" w:hAnsi="Times New Roman" w:eastAsia="Times New Roman"/>
           <w:b w:val="0"/>
           <w:i w:val="0"/>
-          <w:sz w:val="26"/>
+          <w:sz w:val="22"/>
         </w:rPr>
         <w:t>Nơi cư trú: {{residence_address}}</w:t>
       </w:r>
     </w:p>
     <w:p>
+      <w:pPr>
+        <w:spacing w:before="0" w:after="20" w:line="240" w:lineRule="auto"/>
+        <w:ind w:left="0"/>
+        <w:jc w:val="both"/>
+      </w:pPr>
       <w:r>
         <w:rPr>
+          <w:rFonts w:ascii="Times New Roman" w:hAnsi="Times New Roman" w:eastAsia="Times New Roman"/>
           <w:b w:val="0"/>
           <w:i w:val="0"/>
-          <w:sz w:val="26"/>
+          <w:sz w:val="22"/>
         </w:rPr>
         <w:t>Thẻ Căn cước hoặc số định danh cá nhân: {{citizen_id}}</w:t>
       </w:r>
     </w:p>
     <w:p>
+      <w:pPr>
+        <w:spacing w:before="0" w:after="20" w:line="240" w:lineRule="auto"/>
+        <w:ind w:left="0"/>
+        <w:jc w:val="both"/>
+      </w:pPr>
       <w:r>
         <w:rPr>
+          <w:rFonts w:ascii="Times New Roman" w:hAnsi="Times New Roman" w:eastAsia="Times New Roman"/>
           <w:b w:val="0"/>
           <w:i w:val="0"/>
-          <w:sz w:val="26"/>
+          <w:sz w:val="22"/>
         </w:rPr>
         <w:t>Quan hệ với người chết: {{deceased_relationship}}</w:t>
       </w:r>
     </w:p>
     <w:p>
+      <w:pPr>
+        <w:spacing w:before="0" w:after="60" w:line="240" w:lineRule="auto"/>
+        <w:ind w:left="0"/>
+        <w:jc w:val="both"/>
+      </w:pPr>
       <w:r>
         <w:rPr>
+          <w:rFonts w:ascii="Times New Roman" w:hAnsi="Times New Roman" w:eastAsia="Times New Roman"/>
+          <w:b w:val="0"/>
+          <w:i w:val="0"/>
+          <w:sz w:val="22"/>
+        </w:rPr>
+        <w:t>Nội dung đề nghị: {{request_content}}</w:t>
+      </w:r>
+    </w:p>
+    <w:p>
+      <w:pPr>
+        <w:spacing w:before="0" w:after="40" w:line="240" w:lineRule="auto"/>
+        <w:ind w:left="0"/>
+        <w:jc w:val="both"/>
+      </w:pPr>
+      <w:r>
+        <w:rPr>
+          <w:rFonts w:ascii="Times New Roman" w:hAnsi="Times New Roman" w:eastAsia="Times New Roman"/>
           <w:b/>
           <w:i w:val="0"/>
-          <w:sz w:val="26"/>
+          <w:sz w:val="22"/>
         </w:rPr>
         <w:t>2. Thông tin người chết được tổ chức mai táng</w:t>
       </w:r>
     </w:p>
     <w:p>
+      <w:pPr>
+        <w:spacing w:before="0" w:after="20" w:line="240" w:lineRule="auto"/>
+        <w:ind w:left="0"/>
+        <w:jc w:val="both"/>
+      </w:pPr>
       <w:r>
         <w:rPr>
+          <w:rFonts w:ascii="Times New Roman" w:hAnsi="Times New Roman" w:eastAsia="Times New Roman"/>
           <w:b w:val="0"/>
           <w:i w:val="0"/>
-          <w:sz w:val="26"/>
+          <w:sz w:val="22"/>
         </w:rPr>
         <w:t>Họ, chữ đệm, tên: {{deceased_full_name}}</w:t>
       </w:r>
     </w:p>
     <w:p>
+      <w:pPr>
+        <w:spacing w:before="0" w:after="20" w:line="240" w:lineRule="auto"/>
+        <w:ind w:left="0"/>
+        <w:jc w:val="both"/>
+      </w:pPr>
       <w:r>
         <w:rPr>
+          <w:rFonts w:ascii="Times New Roman" w:hAnsi="Times New Roman" w:eastAsia="Times New Roman"/>
           <w:b w:val="0"/>
           <w:i w:val="0"/>
-          <w:sz w:val="26"/>
+          <w:sz w:val="22"/>
         </w:rPr>
         <w:t>Ngày, tháng, năm sinh: {{deceased_date_of_birth}}</w:t>
       </w:r>
     </w:p>
     <w:p>
+      <w:pPr>
+        <w:spacing w:before="0" w:after="20" w:line="240" w:lineRule="auto"/>
+        <w:ind w:left="0"/>
+        <w:jc w:val="both"/>
+      </w:pPr>
       <w:r>
         <w:rPr>
+          <w:rFonts w:ascii="Times New Roman" w:hAnsi="Times New Roman" w:eastAsia="Times New Roman"/>
           <w:b w:val="0"/>
           <w:i w:val="0"/>
-          <w:sz w:val="26"/>
+          <w:sz w:val="22"/>
         </w:rPr>
-        <w:t>Giới tính: {{deceased_gender}}</w:t>
+        <w:t>Giới tính: {{deceased_gender}}     Dân tộc: {{deceased_ethnic_group}}     Quốc tịch: {{deceased_nationality}}</w:t>
       </w:r>
     </w:p>
     <w:p>
+      <w:pPr>
+        <w:spacing w:before="0" w:after="20" w:line="240" w:lineRule="auto"/>
+        <w:ind w:left="0"/>
+        <w:jc w:val="both"/>
+      </w:pPr>
       <w:r>
         <w:rPr>
+          <w:rFonts w:ascii="Times New Roman" w:hAnsi="Times New Roman" w:eastAsia="Times New Roman"/>
           <w:b w:val="0"/>
           <w:i w:val="0"/>
-          <w:sz w:val="26"/>
-        </w:rPr>
-        <w:t>Dân tộc: {{deceased_ethnic_group}}</w:t>
-      </w:r>
-    </w:p>
-    <w:p>
-      <w:r>
-        <w:rPr>
-          <w:b w:val="0"/>
-          <w:i w:val="0"/>
-          <w:sz w:val="26"/>
-        </w:rPr>
-        <w:t>Quốc tịch: {{deceased_nationality}}</w:t>
-      </w:r>
-    </w:p>
-    <w:p>
-      <w:r>
-        <w:rPr>
-          <w:b w:val="0"/>
-          <w:i w:val="0"/>
-          <w:sz w:val="26"/>
+          <w:sz w:val="22"/>
         </w:rPr>
         <w:t>Nơi cư trú: {{deceased_residence_address}}</w:t>
       </w:r>
     </w:p>
     <w:p>
+      <w:pPr>
+        <w:spacing w:before="0" w:after="20" w:line="240" w:lineRule="auto"/>
+        <w:ind w:left="0"/>
+        <w:jc w:val="both"/>
+      </w:pPr>
       <w:r>
         <w:rPr>
+          <w:rFonts w:ascii="Times New Roman" w:hAnsi="Times New Roman" w:eastAsia="Times New Roman"/>
           <w:b w:val="0"/>
           <w:i w:val="0"/>
-          <w:sz w:val="26"/>
+          <w:sz w:val="22"/>
         </w:rPr>
         <w:t>Thẻ Căn cước hoặc số định danh cá nhân: {{deceased_citizen_id}}</w:t>
       </w:r>
     </w:p>
     <w:p>
+      <w:pPr>
+        <w:spacing w:before="0" w:after="20" w:line="240" w:lineRule="auto"/>
+        <w:ind w:left="0"/>
+        <w:jc w:val="both"/>
+      </w:pPr>
       <w:r>
         <w:rPr>
+          <w:rFonts w:ascii="Times New Roman" w:hAnsi="Times New Roman" w:eastAsia="Times New Roman"/>
           <w:b w:val="0"/>
           <w:i w:val="0"/>
-          <w:sz w:val="26"/>
+          <w:sz w:val="22"/>
         </w:rPr>
-        <w:t>Đã chết vào ngày: {{deceased_death_date}}, {{deceased_death_hour}} giờ {{deceased_death_minute}} phút</w:t>
+        <w:t>Đã chết vào lúc: {{deceased_death_hour}} giờ {{deceased_death_minute}} phút, ngày {{deceased_death_date}}</w:t>
       </w:r>
     </w:p>
     <w:p>
+      <w:pPr>
+        <w:spacing w:before="0" w:after="20" w:line="240" w:lineRule="auto"/>
+        <w:ind w:left="0"/>
+        <w:jc w:val="both"/>
+      </w:pPr>
       <w:r>
         <w:rPr>
+          <w:rFonts w:ascii="Times New Roman" w:hAnsi="Times New Roman" w:eastAsia="Times New Roman"/>
           <w:b w:val="0"/>
           <w:i w:val="0"/>
-          <w:sz w:val="26"/>
+          <w:sz w:val="22"/>
         </w:rPr>
         <w:t>Nơi chết: {{deceased_death_place}}</w:t>
       </w:r>
     </w:p>
     <w:p>
+      <w:pPr>
+        <w:spacing w:before="0" w:after="20" w:line="240" w:lineRule="auto"/>
+        <w:ind w:left="0"/>
+        <w:jc w:val="both"/>
+      </w:pPr>
       <w:r>
         <w:rPr>
+          <w:rFonts w:ascii="Times New Roman" w:hAnsi="Times New Roman" w:eastAsia="Times New Roman"/>
           <w:b w:val="0"/>
           <w:i w:val="0"/>
-          <w:sz w:val="26"/>
+          <w:sz w:val="22"/>
         </w:rPr>
         <w:t>Nguyên nhân chết: {{deceased_death_cause}}</w:t>
       </w:r>
     </w:p>
     <w:p>
+      <w:pPr>
+        <w:spacing w:before="0" w:after="20" w:line="240" w:lineRule="auto"/>
+        <w:ind w:left="0"/>
+        <w:jc w:val="both"/>
+      </w:pPr>
       <w:r>
         <w:rPr>
+          <w:rFonts w:ascii="Times New Roman" w:hAnsi="Times New Roman" w:eastAsia="Times New Roman"/>
           <w:b w:val="0"/>
           <w:i w:val="0"/>
-          <w:sz w:val="26"/>
+          <w:sz w:val="22"/>
         </w:rPr>
-        <w:t>Số Giấy báo tử/Giấy tờ thay thế Giấy báo tử: {{death_certificate_number}}, ngày {{death_certificate_date}}, do {{death_certificate_issuer}} cấp</w:t>
+        <w:t>Số Giấy báo tử/Giấy tờ thay thế Giấy báo tử: {{death_certificate_number}} do {{death_certificate_issuer}} cấp ngày {{death_certificate_date}}</w:t>
       </w:r>
     </w:p>
     <w:p>
       <w:r>
+        <w:br w:type="page"/>
+      </w:r>
+    </w:p>
+    <w:p>
+      <w:pPr>
+        <w:spacing w:before="0" w:after="40" w:line="240" w:lineRule="auto"/>
+        <w:ind w:left="0"/>
+        <w:jc w:val="both"/>
+      </w:pPr>
+      <w:r>
         <w:rPr>
+          <w:rFonts w:ascii="Times New Roman" w:hAnsi="Times New Roman" w:eastAsia="Times New Roman"/>
           <w:b/>
           <w:i w:val="0"/>
-          <w:sz w:val="26"/>
+          <w:sz w:val="22"/>
         </w:rPr>
         <w:t>3. Người, tổ chức lo mai táng nhận hỗ trợ chi phí mai táng</w:t>
       </w:r>
     </w:p>
     <w:p>
+      <w:pPr>
+        <w:spacing w:before="0" w:after="20" w:line="240" w:lineRule="auto"/>
+        <w:ind w:left="0"/>
+        <w:jc w:val="both"/>
+      </w:pPr>
       <w:r>
         <w:rPr>
-          <w:b w:val="0"/>
-          <w:i/>
-          <w:sz w:val="26"/>
+          <w:rFonts w:ascii="Times New Roman" w:hAnsi="Times New Roman" w:eastAsia="Times New Roman"/>
+          <w:b/>
+          <w:i w:val="0"/>
+          <w:sz w:val="22"/>
         </w:rPr>
         <w:t>3.1. Trường hợp cá nhân, thân nhân đứng ra tổ chức mai táng:</w:t>
       </w:r>
     </w:p>
     <w:p>
+      <w:pPr>
+        <w:spacing w:before="0" w:after="20" w:line="240" w:lineRule="auto"/>
+        <w:ind w:left="0"/>
+        <w:jc w:val="both"/>
+      </w:pPr>
       <w:r>
         <w:rPr>
+          <w:rFonts w:ascii="Times New Roman" w:hAnsi="Times New Roman" w:eastAsia="Times New Roman"/>
           <w:b w:val="0"/>
           <w:i w:val="0"/>
-          <w:sz w:val="26"/>
+          <w:sz w:val="22"/>
         </w:rPr>
         <w:t>Họ và tên: {{full_name}}</w:t>
       </w:r>
     </w:p>
     <w:p>
+      <w:pPr>
+        <w:spacing w:before="0" w:after="20" w:line="240" w:lineRule="auto"/>
+        <w:ind w:left="0"/>
+        <w:jc w:val="both"/>
+      </w:pPr>
       <w:r>
         <w:rPr>
+          <w:rFonts w:ascii="Times New Roman" w:hAnsi="Times New Roman" w:eastAsia="Times New Roman"/>
           <w:b w:val="0"/>
           <w:i w:val="0"/>
-          <w:sz w:val="26"/>
+          <w:sz w:val="22"/>
         </w:rPr>
-        <w:t>Ngày, tháng, năm sinh: {{date_of_birth}}</w:t>
+        <w:t>Ngày, tháng, năm sinh: {{date_of_birth}}     Nam/Nữ: {{gender}}</w:t>
       </w:r>
     </w:p>
     <w:p>
+      <w:pPr>
+        <w:spacing w:before="0" w:after="20" w:line="240" w:lineRule="auto"/>
+        <w:ind w:left="0"/>
+        <w:jc w:val="both"/>
+      </w:pPr>
       <w:r>
         <w:rPr>
+          <w:rFonts w:ascii="Times New Roman" w:hAnsi="Times New Roman" w:eastAsia="Times New Roman"/>
           <w:b w:val="0"/>
           <w:i w:val="0"/>
-          <w:sz w:val="26"/>
+          <w:sz w:val="22"/>
         </w:rPr>
         <w:t>Thẻ Căn cước hoặc số định danh cá nhân: {{citizen_id}}</w:t>
       </w:r>
     </w:p>
     <w:p>
+      <w:pPr>
+        <w:spacing w:before="0" w:after="20" w:line="240" w:lineRule="auto"/>
+        <w:ind w:left="0"/>
+        <w:jc w:val="both"/>
+      </w:pPr>
       <w:r>
         <w:rPr>
+          <w:rFonts w:ascii="Times New Roman" w:hAnsi="Times New Roman" w:eastAsia="Times New Roman"/>
           <w:b w:val="0"/>
           <w:i w:val="0"/>
-          <w:sz w:val="26"/>
+          <w:sz w:val="22"/>
         </w:rPr>
         <w:t>Nơi cư trú: {{residence_address}}</w:t>
       </w:r>
     </w:p>
     <w:p>
+      <w:pPr>
+        <w:spacing w:before="0" w:after="20" w:line="240" w:lineRule="auto"/>
+        <w:ind w:left="0"/>
+        <w:jc w:val="both"/>
+      </w:pPr>
       <w:r>
         <w:rPr>
+          <w:rFonts w:ascii="Times New Roman" w:hAnsi="Times New Roman" w:eastAsia="Times New Roman"/>
           <w:b w:val="0"/>
           <w:i w:val="0"/>
-          <w:sz w:val="26"/>
+          <w:sz w:val="22"/>
         </w:rPr>
         <w:t>Quan hệ với người chết: {{deceased_relationship}}</w:t>
       </w:r>
     </w:p>
     <w:p>
+      <w:pPr>
+        <w:spacing w:before="0" w:after="40" w:line="240" w:lineRule="auto"/>
+        <w:ind w:left="0"/>
+        <w:jc w:val="both"/>
+      </w:pPr>
       <w:r>
         <w:rPr>
+          <w:rFonts w:ascii="Times New Roman" w:hAnsi="Times New Roman" w:eastAsia="Times New Roman"/>
           <w:b w:val="0"/>
           <w:i w:val="0"/>
-          <w:sz w:val="26"/>
+          <w:sz w:val="22"/>
         </w:rPr>
         <w:t>Số điện thoại liên hệ: {{phone_number}}</w:t>
       </w:r>
     </w:p>
     <w:p>
+      <w:pPr>
+        <w:spacing w:before="0" w:after="20" w:line="240" w:lineRule="auto"/>
+        <w:ind w:left="0"/>
+        <w:jc w:val="both"/>
+      </w:pPr>
       <w:r>
         <w:rPr>
-          <w:b w:val="0"/>
-          <w:i/>
-          <w:sz w:val="26"/>
+          <w:rFonts w:ascii="Times New Roman" w:hAnsi="Times New Roman" w:eastAsia="Times New Roman"/>
+          <w:b/>
+          <w:i w:val="0"/>
+          <w:sz w:val="22"/>
         </w:rPr>
         <w:t>3.2. Trường hợp cơ quan, tổ chức đứng ra tổ chức mai táng:</w:t>
       </w:r>
     </w:p>
     <w:p>
+      <w:pPr>
+        <w:spacing w:before="0" w:after="20" w:line="240" w:lineRule="auto"/>
+        <w:ind w:left="0"/>
+        <w:jc w:val="both"/>
+      </w:pPr>
       <w:r>
         <w:rPr>
+          <w:rFonts w:ascii="Times New Roman" w:hAnsi="Times New Roman" w:eastAsia="Times New Roman"/>
           <w:b w:val="0"/>
           <w:i w:val="0"/>
-          <w:sz w:val="26"/>
+          <w:sz w:val="22"/>
         </w:rPr>
         <w:t>Tên tổ chức: {{org_name}}</w:t>
       </w:r>
     </w:p>
     <w:p>
+      <w:pPr>
+        <w:spacing w:before="0" w:after="20" w:line="240" w:lineRule="auto"/>
+        <w:ind w:left="0"/>
+        <w:jc w:val="both"/>
+      </w:pPr>
       <w:r>
         <w:rPr>
+          <w:rFonts w:ascii="Times New Roman" w:hAnsi="Times New Roman" w:eastAsia="Times New Roman"/>
           <w:b w:val="0"/>
           <w:i w:val="0"/>
-          <w:sz w:val="26"/>
+          <w:sz w:val="22"/>
         </w:rPr>
         <w:t>Địa chỉ: {{org_address}}</w:t>
       </w:r>
     </w:p>
     <w:p>
+      <w:pPr>
+        <w:spacing w:before="0" w:after="20" w:line="240" w:lineRule="auto"/>
+        <w:ind w:left="0"/>
+        <w:jc w:val="both"/>
+      </w:pPr>
       <w:r>
         <w:rPr>
+          <w:rFonts w:ascii="Times New Roman" w:hAnsi="Times New Roman" w:eastAsia="Times New Roman"/>
           <w:b w:val="0"/>
           <w:i w:val="0"/>
-          <w:sz w:val="26"/>
+          <w:sz w:val="22"/>
         </w:rPr>
-        <w:t>Người đại diện theo pháp luật: {{org_representative_name}}</w:t>
+        <w:t>Người đại diện theo pháp luật: {{org_representative_name}}     Chức vụ: {{org_representative_title}}</w:t>
       </w:r>
     </w:p>
     <w:p>
+      <w:pPr>
+        <w:spacing w:before="0" w:after="40" w:line="240" w:lineRule="auto"/>
+        <w:ind w:left="0"/>
+        <w:jc w:val="both"/>
+      </w:pPr>
       <w:r>
         <w:rPr>
+          <w:rFonts w:ascii="Times New Roman" w:hAnsi="Times New Roman" w:eastAsia="Times New Roman"/>
           <w:b w:val="0"/>
           <w:i w:val="0"/>
-          <w:sz w:val="26"/>
-        </w:rPr>
-        <w:t>Chức vụ: {{org_representative_title}}</w:t>
-      </w:r>
-    </w:p>
-    <w:p>
-      <w:r>
-        <w:rPr>
-          <w:b w:val="0"/>
-          <w:i w:val="0"/>
-          <w:sz w:val="26"/>
+          <w:sz w:val="22"/>
         </w:rPr>
         <w:t>Số điện thoại: {{org_phone}}</w:t>
       </w:r>
     </w:p>
     <w:p>
+      <w:pPr>
+        <w:spacing w:before="0" w:after="20" w:line="240" w:lineRule="auto"/>
+        <w:ind w:left="0"/>
+        <w:jc w:val="both"/>
+      </w:pPr>
       <w:r>
         <w:rPr>
+          <w:rFonts w:ascii="Times New Roman" w:hAnsi="Times New Roman" w:eastAsia="Times New Roman"/>
           <w:b/>
           <w:i w:val="0"/>
-          <w:sz w:val="26"/>
+          <w:sz w:val="22"/>
         </w:rPr>
         <w:t>4. Phương thức nhận chi phí hỗ trợ mai táng:</w:t>
       </w:r>
     </w:p>
     <w:p>
+      <w:pPr>
+        <w:spacing w:before="0" w:after="20" w:line="240" w:lineRule="auto"/>
+        <w:ind w:left="283"/>
+        <w:jc w:val="both"/>
+      </w:pPr>
       <w:r>
         <w:rPr>
+          <w:rFonts w:ascii="Times New Roman" w:hAnsi="Times New Roman" w:eastAsia="Times New Roman"/>
           <w:b w:val="0"/>
           <w:i w:val="0"/>
-          <w:sz w:val="26"/>
+          <w:sz w:val="22"/>
         </w:rPr>
         <w:t>{{bank_payment_check}} Tài khoản ngân hàng:</w:t>
       </w:r>
     </w:p>
     <w:p>
+      <w:pPr>
+        <w:spacing w:before="0" w:after="20" w:line="240" w:lineRule="auto"/>
+        <w:ind w:left="567"/>
+        <w:jc w:val="both"/>
+      </w:pPr>
       <w:r>
         <w:rPr>
+          <w:rFonts w:ascii="Times New Roman" w:hAnsi="Times New Roman" w:eastAsia="Times New Roman"/>
           <w:b w:val="0"/>
           <w:i w:val="0"/>
-          <w:sz w:val="26"/>
+          <w:sz w:val="22"/>
         </w:rPr>
         <w:t>Tên chủ tài khoản: {{bank_account_name}}</w:t>
       </w:r>
     </w:p>
     <w:p>
+      <w:pPr>
+        <w:spacing w:before="0" w:after="20" w:line="240" w:lineRule="auto"/>
+        <w:ind w:left="567"/>
+        <w:jc w:val="both"/>
+      </w:pPr>
       <w:r>
         <w:rPr>
+          <w:rFonts w:ascii="Times New Roman" w:hAnsi="Times New Roman" w:eastAsia="Times New Roman"/>
           <w:b w:val="0"/>
           <w:i w:val="0"/>
-          <w:sz w:val="26"/>
+          <w:sz w:val="22"/>
         </w:rPr>
         <w:t>Số tài khoản: {{bank_account_number}}</w:t>
       </w:r>
     </w:p>
     <w:p>
+      <w:pPr>
+        <w:spacing w:before="0" w:after="20" w:line="240" w:lineRule="auto"/>
+        <w:ind w:left="567"/>
+        <w:jc w:val="both"/>
+      </w:pPr>
       <w:r>
         <w:rPr>
+          <w:rFonts w:ascii="Times New Roman" w:hAnsi="Times New Roman" w:eastAsia="Times New Roman"/>
           <w:b w:val="0"/>
           <w:i w:val="0"/>
-          <w:sz w:val="26"/>
+          <w:sz w:val="22"/>
         </w:rPr>
         <w:t>Ngân hàng: {{bank_name}}</w:t>
       </w:r>
     </w:p>
     <w:p>
+      <w:pPr>
+        <w:spacing w:before="0" w:after="60" w:line="240" w:lineRule="auto"/>
+        <w:ind w:left="283"/>
+        <w:jc w:val="both"/>
+      </w:pPr>
       <w:r>
         <w:rPr>
+          <w:rFonts w:ascii="Times New Roman" w:hAnsi="Times New Roman" w:eastAsia="Times New Roman"/>
           <w:b w:val="0"/>
           <w:i w:val="0"/>
-          <w:sz w:val="26"/>
+          <w:sz w:val="22"/>
         </w:rPr>
         <w:t>{{cash_payment_check}} Tiền mặt</w:t>
       </w:r>
     </w:p>
     <w:p>
-      <w:pPr/>
-      <w:r>
-        <w:t>5. Nội dung đề nghị: {{request_content}}</w:t>
-      </w:r>
-    </w:p>
-    <w:p>
+      <w:pPr>
+        <w:spacing w:before="0" w:after="80" w:line="240" w:lineRule="auto"/>
+        <w:ind w:left="0"/>
+        <w:jc w:val="both"/>
+      </w:pPr>
       <w:r>
         <w:rPr>
+          <w:rFonts w:ascii="Times New Roman" w:hAnsi="Times New Roman" w:eastAsia="Times New Roman"/>
           <w:b w:val="0"/>
           <w:i w:val="0"/>
-          <w:sz w:val="26"/>
+          <w:sz w:val="22"/>
         </w:rPr>
         <w:t>Tôi cam đoan những nội dung khai trên đây là đúng sự thật và chịu trách nhiệm trước pháp luật về nội dung khai của mình.</w:t>
       </w:r>
     </w:p>
-    <w:p/>
     <w:tbl>
       <w:tblPr>
         <w:tblW w:type="auto" w:w="0"/>
+        <w:tblLayout w:type="fixed"/>
         <w:tblLook w:firstColumn="1" w:firstRow="1" w:lastColumn="0" w:lastRow="0" w:noHBand="0" w:noVBand="1" w:val="04A0"/>
+        <w:tblBorders>
+          <w:top w:val="nil"/>
+          <w:left w:val="nil"/>
+          <w:bottom w:val="nil"/>
+          <w:right w:val="nil"/>
+          <w:insideH w:val="nil"/>
+          <w:insideV w:val="nil"/>
+        </w:tblBorders>
       </w:tblPr>
       <w:tblGrid>
-        <w:gridCol w:w="4680"/>
-        <w:gridCol w:w="4680"/>
+        <w:gridCol w:w="4989"/>
+        <w:gridCol w:w="4989"/>
       </w:tblGrid>
       <w:tr>
         <w:tc>
           <w:tcPr>
-            <w:tcW w:type="dxa" w:w="4680"/>
+            <w:tcW w:type="dxa" w:w="4932"/>
+            <w:vAlign w:val="top"/>
           </w:tcPr>
           <w:p>
             <w:pPr>
+              <w:spacing w:after="0"/>
               <w:jc w:val="center"/>
             </w:pPr>
             <w:r>
               <w:rPr>
-                <w:sz w:val="26"/>
+                <w:rFonts w:ascii="Times New Roman" w:hAnsi="Times New Roman" w:eastAsia="Times New Roman"/>
+                <w:b w:val="0"/>
+                <w:i w:val="0"/>
+                <w:sz w:val="21"/>
               </w:rPr>
               <w:t>Ngày.... tháng.... năm ...</w:t>
+              <w:br/>
             </w:r>
-          </w:p>
-          <w:p>
-            <w:pPr>
-              <w:jc w:val="center"/>
-            </w:pPr>
             <w:r>
               <w:rPr>
+                <w:rFonts w:ascii="Times New Roman" w:hAnsi="Times New Roman" w:eastAsia="Times New Roman"/>
                 <w:b/>
-                <w:sz w:val="26"/>
+                <w:i w:val="0"/>
+                <w:sz w:val="21"/>
               </w:rPr>
               <w:t>NGƯỜI TIẾP NHẬN TỜ KHAI</w:t>
+              <w:br/>
             </w:r>
-          </w:p>
-          <w:p>
-            <w:pPr>
-              <w:jc w:val="center"/>
-            </w:pPr>
             <w:r>
               <w:rPr>
+                <w:rFonts w:ascii="Times New Roman" w:hAnsi="Times New Roman" w:eastAsia="Times New Roman"/>
+                <w:b w:val="0"/>
                 <w:i/>
-                <w:sz w:val="26"/>
+                <w:sz w:val="21"/>
               </w:rPr>
               <w:t>(Ký, ghi rõ họ tên)</w:t>
             </w:r>
@@ -483,39 +725,40 @@
         </w:tc>
         <w:tc>
           <w:tcPr>
-            <w:tcW w:type="dxa" w:w="4680"/>
+            <w:tcW w:type="dxa" w:w="4932"/>
+            <w:vAlign w:val="top"/>
           </w:tcPr>
           <w:p>
             <w:pPr>
+              <w:spacing w:after="0"/>
               <w:jc w:val="center"/>
             </w:pPr>
             <w:r>
               <w:rPr>
-                <w:sz w:val="26"/>
+                <w:rFonts w:ascii="Times New Roman" w:hAnsi="Times New Roman" w:eastAsia="Times New Roman"/>
+                <w:b w:val="0"/>
+                <w:i w:val="0"/>
+                <w:sz w:val="21"/>
               </w:rPr>
               <w:t>Ngày.... tháng.... năm ...</w:t>
+              <w:br/>
             </w:r>
-          </w:p>
-          <w:p>
-            <w:pPr>
-              <w:jc w:val="center"/>
-            </w:pPr>
             <w:r>
               <w:rPr>
+                <w:rFonts w:ascii="Times New Roman" w:hAnsi="Times New Roman" w:eastAsia="Times New Roman"/>
                 <w:b/>
-                <w:sz w:val="26"/>
+                <w:i w:val="0"/>
+                <w:sz w:val="21"/>
               </w:rPr>
               <w:t>NGƯỜI KHAI</w:t>
+              <w:br/>
             </w:r>
-          </w:p>
-          <w:p>
-            <w:pPr>
-              <w:jc w:val="center"/>
-            </w:pPr>
             <w:r>
               <w:rPr>
+                <w:rFonts w:ascii="Times New Roman" w:hAnsi="Times New Roman" w:eastAsia="Times New Roman"/>
+                <w:b w:val="0"/>
                 <w:i/>
-                <w:sz w:val="26"/>
+                <w:sz w:val="21"/>
               </w:rPr>
               <w:t>(Ký, ghi rõ họ tên)</w:t>
             </w:r>
@@ -524,8 +767,8 @@
       </w:tr>
     </w:tbl>
     <w:sectPr>
-      <w:pgSz w:w="12240" w:h="15840"/>
-      <w:pgMar w:top="851" w:right="1440" w:bottom="993" w:left="1440" w:header="720" w:footer="720" w:gutter="0"/>
+      <w:pgSz w:w="11906" w:h="16838"/>
+      <w:pgMar w:top="765" w:right="964" w:bottom="765" w:left="964" w:header="720" w:footer="720" w:gutter="0"/>
       <w:cols w:space="720"/>
       <w:docGrid w:linePitch="360"/>
     </w:sectPr>
@@ -896,6 +1139,10 @@
     <w:name w:val="Normal"/>
     <w:qFormat/>
     <w:rsid w:val="00FC693F"/>
+    <w:rPr>
+      <w:rFonts w:ascii="Times New Roman" w:hAnsi="Times New Roman" w:eastAsia="Times New Roman"/>
+      <w:sz w:val="22"/>
+    </w:rPr>
   </w:style>
   <w:style w:type="paragraph" w:styleId="Header">
     <w:name w:val="header"/>

</xml_diff>